<commit_message>
feat: grant partners maximum access
</commit_message>
<xml_diff>
--- a/public/documents/vizhufasad-partner-contract-template.docx
+++ b/public/documents/vizhufasad-partner-contract-template.docx
@@ -483,7 +483,7 @@
           <w:color w:val="222622"/>
           <w:sz w:val="20"/>
         </w:rPr>
-        <w:t>Партнёрский код начисляет договорный номинал ВФ-коинов без покупки потребительского пакета и сам по себе не изменяет тарифный уровень аккаунта. Стоимость каждого доступного действия показывается в кабинете до запуска.</w:t>
+        <w:t>Партнёрский код начисляет договорный номинал ВФ-коинов без покупки потребительского пакета и открывает аккаунту все возможности тарифа «Максимум»: все стили и материалы, Pro-генерацию, сравнение вариантов, точечные доработки готового результата и подготовку 4K. Доступ действует в течение срока использования начисленного объёма, указанного в Приложении № 1; при отметке «без отдельного ограничения» — пока действуют аккаунт и сервис. Стоимость каждого доступного действия показывается в кабинете до запуска.</w:t>
       </w:r>
     </w:p>
     <w:p>
@@ -1927,6 +1927,57 @@
                 <w:color w:val="222622"/>
                 <w:sz w:val="18"/>
               </w:rPr>
+              <w:t>Функциональный уровень</w:t>
+            </w:r>
+          </w:p>
+        </w:tc>
+        <w:tc>
+          <w:tcPr>
+            <w:tcW w:type="dxa" w:w="6350"/>
+            <w:tcMar>
+              <w:top w:w="120" w:type="dxa"/>
+              <w:start w:w="140" w:type="dxa"/>
+              <w:bottom w:w="120" w:type="dxa"/>
+              <w:end w:w="140" w:type="dxa"/>
+            </w:tcMar>
+            <w:vAlign w:val="center"/>
+          </w:tcPr>
+          <w:p>
+            <w:r>
+              <w:rPr>
+                <w:rFonts w:ascii="Arial" w:hAnsi="Arial" w:eastAsia="Arial"/>
+                <w:b w:val="0"/>
+                <w:i w:val="0"/>
+                <w:color w:val="222622"/>
+                <w:sz w:val="18"/>
+              </w:rPr>
+              <w:t>Все возможности тарифа «Максимум»</w:t>
+            </w:r>
+          </w:p>
+        </w:tc>
+      </w:tr>
+      <w:tr>
+        <w:tc>
+          <w:tcPr>
+            <w:tcW w:type="dxa" w:w="2948"/>
+            <w:tcMar>
+              <w:top w:w="120" w:type="dxa"/>
+              <w:start w:w="140" w:type="dxa"/>
+              <w:bottom w:w="120" w:type="dxa"/>
+              <w:end w:w="140" w:type="dxa"/>
+            </w:tcMar>
+            <w:vAlign w:val="center"/>
+            <w:shd w:fill="F3EEE7"/>
+          </w:tcPr>
+          <w:p>
+            <w:r>
+              <w:rPr>
+                <w:rFonts w:ascii="Arial" w:hAnsi="Arial" w:eastAsia="Arial"/>
+                <w:b/>
+                <w:i w:val="0"/>
+                <w:color w:val="222622"/>
+                <w:sz w:val="18"/>
+              </w:rPr>
               <w:t>Количество ВФ-коинов</w:t>
             </w:r>
           </w:p>
@@ -2338,7 +2389,7 @@
           <w:color w:val="222622"/>
           <w:sz w:val="19"/>
         </w:rPr>
-        <w:t>после подтверждения оплаты Исполнитель создаёт одноразовый код с указанным номиналом и HMAC-привязкой к email. Полный код передаётся Заказчику один раз по согласованному каналу.</w:t>
+        <w:t>после подтверждения оплаты Исполнитель создаёт одноразовый код с указанным номиналом и HMAC-привязкой к email. Активация кода начисляет согласованный объём ВФ-коинов и открывает все возможности тарифа «Максимум» на срок, указанный выше. Полный код передаётся Заказчику один раз по согласованному каналу.</w:t>
       </w:r>
     </w:p>
     <w:tbl>

</xml_diff>